<commit_message>
Triaged with JKMV3 and speech, fix issue with updated bindings not working with actions
EDDForm:
Bindings file has Reset() and we keep the instance all the time even during reloads.  Actioncontroller has a handle to it so we just can't new it.
Bindings class are made once on startup
OnNewUIEvent/NewHistoryEntryUnfiltered are issued by Form and owned by it. Executed in FromJournalEvents. Instead of piggybacking on the controller. This means that the controller kicks the form, and the form calls these
Form_NewUIEvent passes new Status_ reader variables to the UI events for its use in EVENT and inside a UI event program
Controller: OnNewUIEvent passes back status reader for use by form
ActionFromInputDevices triaged, debug improved, proved to work.
Status reader exports better GUIFocus enum and more flags
</commit_message>
<xml_diff>
--- a/Docs/Action V31 for EDD20.docx
+++ b/Docs/Action V31 for EDD20.docx
@@ -42735,6 +42735,20 @@
         <w:t>EventClass_* = any variables associated with the event. See the code base around UIEvents</w:t>
       </w:r>
     </w:p>
+    <w:p>
+      <w:r>
+        <w:t xml:space="preserve">Status_* </w:t>
+      </w:r>
+      <w:r>
+        <w:rPr>
+          <w:vertAlign w:val="superscript"/>
+        </w:rPr>
+        <w:t xml:space="preserve">[31] </w:t>
+      </w:r>
+      <w:r>
+        <w:t>= status information of various flags from the status.json</w:t>
+      </w:r>
+    </w:p>
     <w:p/>
     <w:p>
       <w:r>
@@ -42924,6 +42938,7 @@
         </w:numPr>
       </w:pPr>
       <w:r>
+        <w:lastRenderedPageBreak/>
         <w:t>MainShipSupercruise,</w:t>
       </w:r>
     </w:p>
@@ -42936,7 +42951,6 @@
         </w:numPr>
       </w:pPr>
       <w:r>
-        <w:lastRenderedPageBreak/>
         <w:t>MainShipLanded,</w:t>
       </w:r>
     </w:p>
@@ -43594,6 +43608,7 @@
         </w:numPr>
       </w:pPr>
       <w:r>
+        <w:lastRenderedPageBreak/>
         <w:t>EventClass_</w:t>
       </w:r>
       <w:r>
@@ -43609,7 +43624,6 @@
         </w:numPr>
       </w:pPr>
       <w:r>
-        <w:lastRenderedPageBreak/>
         <w:t>EventClass_</w:t>
       </w:r>
       <w:r>
@@ -44024,6 +44038,7 @@
     <w:p/>
     <w:p>
       <w:r>
+        <w:lastRenderedPageBreak/>
         <w:t xml:space="preserve">For MatchesSemiColonList you can build complicated </w:t>
       </w:r>
       <w:r>
@@ -44039,7 +44054,6 @@
         </w:numPr>
       </w:pPr>
       <w:r>
-        <w:lastRenderedPageBreak/>
         <w:t>"Increase|More Engine Power;More Engines;Engines Up;Increase Engines"</w:t>
       </w:r>
     </w:p>
@@ -44249,6 +44263,7 @@
       <w:bookmarkStart w:id="348" w:name="_Toc233271646"/>
       <w:bookmarkStart w:id="349" w:name="_Toc233272072"/>
       <w:r>
+        <w:lastRenderedPageBreak/>
         <w:t xml:space="preserve">User Key Press </w:t>
       </w:r>
       <w:r>

</xml_diff>